<commit_message>
Overhaul make_docx.py and update reference.docx styles
make_docx.py:
- Rename output to IFC_Alignment_Geometry_Implementation_Guide.docx
- Remove make_pdf.py (PDF now exported from Word)
- Apply Title/Subtitle/Cover Text styles to cover page elements
- Apply Frontmatter Heading style to Foreword, Notation, and TOC heading
- Apply Title style to Index heading
- Inject live TOC field using Heading 1 style (replaces unreliable bookmark approach)
- Two-section page numbering: Roman numerals (i, ii...) for front matter,
  Arabic from Chapter 1; cover page suppressed
- Disable implicit_figures to prevent alt text rendering as captions
- Read chapter files with utf-8-sig to handle BOM gracefully
- Scale cover image to 6.5x6.7in via preprocessing (keeps markdown clean)

reference.docx: add Frontmatter Heading, Cover Text, Title, and Subtitle styles

Co-Authored-By: Claude Sonnet 4.6 <noreply@anthropic.com>
</commit_message>
<xml_diff>
--- a/reference.docx
+++ b/reference.docx
@@ -13,8 +13,15 @@
     <w:p>
       <w:pPr>
         <w:pStyle w:val="Subtitle"/>
-      </w:pPr>
-      <w:r>
+        <w:rPr>
+          <w:i w:val="0"/>
+          <w:iCs/>
+        </w:rPr>
+      </w:pPr>
+      <w:r>
+        <w:rPr>
+          <w:iCs/>
+        </w:rPr>
         <w:t xml:space="preserve"> Subtitle </w:t>
       </w:r>
     </w:p>
@@ -44,6 +51,22 @@
     </w:p>
     <w:p>
       <w:pPr>
+        <w:pStyle w:val="CoverText"/>
+      </w:pPr>
+      <w:r>
+        <w:t>Cover Text</w:t>
+      </w:r>
+    </w:p>
+    <w:p>
+      <w:pPr>
+        <w:pStyle w:val="FrontmatterHeading"/>
+      </w:pPr>
+      <w:r>
+        <w:t>Frontmatter Heading</w:t>
+      </w:r>
+    </w:p>
+    <w:p>
+      <w:pPr>
         <w:pStyle w:val="Heading1"/>
       </w:pPr>
       <w:bookmarkStart w:id="0" w:name="heading-1"/>
@@ -135,8 +158,16 @@
     <w:p>
       <w:pPr>
         <w:pStyle w:val="FirstParagraph"/>
-      </w:pPr>
-      <w:r>
+        <w:rPr>
+          <w:sz w:val="20"/>
+          <w:szCs w:val="20"/>
+        </w:rPr>
+      </w:pPr>
+      <w:r>
+        <w:rPr>
+          <w:sz w:val="20"/>
+          <w:szCs w:val="20"/>
+        </w:rPr>
         <w:t xml:space="preserve"> First Paragraph. </w:t>
       </w:r>
     </w:p>
@@ -145,27 +176,63 @@
         <w:pStyle w:val="BodyText"/>
       </w:pPr>
       <w:r>
+        <w:rPr>
+          <w:sz w:val="20"/>
+          <w:szCs w:val="20"/>
+        </w:rPr>
         <w:t xml:space="preserve"> Body Text. Body Text Char.   </w:t>
       </w:r>
       <w:r>
         <w:rPr>
           <w:rStyle w:val="VerbatimChar"/>
-        </w:rPr>
-        <w:t xml:space="preserve"> Verbatim Char </w:t>
-      </w:r>
-      <w:r>
-        <w:t xml:space="preserve"> .   </w:t>
+          <w:sz w:val="20"/>
+          <w:szCs w:val="20"/>
+        </w:rPr>
+        <w:t xml:space="preserve"> Verbatim </w:t>
+      </w:r>
+      <w:proofErr w:type="gramStart"/>
+      <w:r>
+        <w:rPr>
+          <w:rStyle w:val="VerbatimChar"/>
+          <w:sz w:val="20"/>
+          <w:szCs w:val="20"/>
+        </w:rPr>
+        <w:t xml:space="preserve">Char </w:t>
+      </w:r>
+      <w:r>
+        <w:rPr>
+          <w:sz w:val="20"/>
+          <w:szCs w:val="20"/>
+        </w:rPr>
+        <w:t xml:space="preserve"> .</w:t>
+      </w:r>
+      <w:proofErr w:type="gramEnd"/>
+      <w:r>
+        <w:rPr>
+          <w:sz w:val="20"/>
+          <w:szCs w:val="20"/>
+        </w:rPr>
+        <w:t xml:space="preserve">   </w:t>
       </w:r>
       <w:hyperlink r:id="rId7">
         <w:r>
           <w:rPr>
             <w:rStyle w:val="Hyperlink"/>
+            <w:sz w:val="20"/>
+            <w:szCs w:val="20"/>
           </w:rPr>
           <w:t xml:space="preserve"> Hyperlink </w:t>
         </w:r>
       </w:hyperlink>
       <w:r>
-        <w:t xml:space="preserve"> .    Footnote. </w:t>
+        <w:rPr>
+          <w:sz w:val="20"/>
+          <w:szCs w:val="20"/>
+        </w:rPr>
+        <w:t xml:space="preserve"> .    Footnote</w:t>
+      </w:r>
+      <w:r>
+        <w:t xml:space="preserve">. </w:t>
       </w:r>
       <w:r>
         <w:rPr>
@@ -179,11 +246,15 @@
         <w:pStyle w:val="BlockText"/>
         <w:rPr>
           <w:rFonts w:ascii="Consolas" w:hAnsi="Consolas"/>
+          <w:sz w:val="20"/>
+          <w:szCs w:val="20"/>
         </w:rPr>
       </w:pPr>
       <w:r>
         <w:rPr>
           <w:rFonts w:ascii="Consolas" w:hAnsi="Consolas"/>
+          <w:sz w:val="20"/>
+          <w:szCs w:val="20"/>
         </w:rPr>
         <w:t xml:space="preserve"> Block Text. </w:t>
       </w:r>
@@ -191,8 +262,16 @@
     <w:p>
       <w:pPr>
         <w:pStyle w:val="TableCaption"/>
-      </w:pPr>
-      <w:r>
+        <w:rPr>
+          <w:sz w:val="20"/>
+          <w:szCs w:val="20"/>
+        </w:rPr>
+      </w:pPr>
+      <w:r>
+        <w:rPr>
+          <w:sz w:val="20"/>
+          <w:szCs w:val="20"/>
+        </w:rPr>
         <w:t xml:space="preserve"> Table caption. </w:t>
       </w:r>
     </w:p>
@@ -203,8 +282,8 @@
         <w:tblLook w:val="07E0" w:firstRow="1" w:lastRow="1" w:firstColumn="1" w:lastColumn="1" w:noHBand="1" w:noVBand="1"/>
       </w:tblPr>
       <w:tblGrid>
-        <w:gridCol w:w="831"/>
-        <w:gridCol w:w="831"/>
+        <w:gridCol w:w="729"/>
+        <w:gridCol w:w="729"/>
       </w:tblGrid>
       <w:tr>
         <w:trPr>
@@ -217,8 +296,16 @@
           <w:p>
             <w:pPr>
               <w:pStyle w:val="Compact"/>
+              <w:rPr>
+                <w:sz w:val="20"/>
+                <w:szCs w:val="20"/>
+              </w:rPr>
             </w:pPr>
             <w:r>
+              <w:rPr>
+                <w:sz w:val="20"/>
+                <w:szCs w:val="20"/>
+              </w:rPr>
               <w:t xml:space="preserve"> Table </w:t>
             </w:r>
           </w:p>
@@ -230,8 +317,16 @@
           <w:p>
             <w:pPr>
               <w:pStyle w:val="Compact"/>
+              <w:rPr>
+                <w:sz w:val="20"/>
+                <w:szCs w:val="20"/>
+              </w:rPr>
             </w:pPr>
             <w:r>
+              <w:rPr>
+                <w:sz w:val="20"/>
+                <w:szCs w:val="20"/>
+              </w:rPr>
               <w:t xml:space="preserve"> Table </w:t>
             </w:r>
           </w:p>
@@ -245,8 +340,16 @@
           <w:p>
             <w:pPr>
               <w:pStyle w:val="Compact"/>
+              <w:rPr>
+                <w:sz w:val="20"/>
+                <w:szCs w:val="20"/>
+              </w:rPr>
             </w:pPr>
             <w:r>
+              <w:rPr>
+                <w:sz w:val="20"/>
+                <w:szCs w:val="20"/>
+              </w:rPr>
               <w:t xml:space="preserve"> 1 </w:t>
             </w:r>
           </w:p>
@@ -258,8 +361,16 @@
           <w:p>
             <w:pPr>
               <w:pStyle w:val="Compact"/>
+              <w:rPr>
+                <w:sz w:val="20"/>
+                <w:szCs w:val="20"/>
+              </w:rPr>
             </w:pPr>
             <w:r>
+              <w:rPr>
+                <w:sz w:val="20"/>
+                <w:szCs w:val="20"/>
+              </w:rPr>
               <w:t xml:space="preserve"> 2 </w:t>
             </w:r>
           </w:p>
@@ -269,40 +380,80 @@
     <w:p>
       <w:pPr>
         <w:pStyle w:val="ImageCaption"/>
-      </w:pPr>
-      <w:r>
+        <w:rPr>
+          <w:sz w:val="20"/>
+          <w:szCs w:val="20"/>
+        </w:rPr>
+      </w:pPr>
+      <w:r>
+        <w:rPr>
+          <w:sz w:val="20"/>
+          <w:szCs w:val="20"/>
+        </w:rPr>
         <w:t xml:space="preserve"> Image Caption </w:t>
       </w:r>
     </w:p>
     <w:p>
       <w:pPr>
         <w:pStyle w:val="DefinitionTerm"/>
-      </w:pPr>
-      <w:r>
+        <w:rPr>
+          <w:sz w:val="20"/>
+          <w:szCs w:val="20"/>
+        </w:rPr>
+      </w:pPr>
+      <w:r>
+        <w:rPr>
+          <w:sz w:val="20"/>
+          <w:szCs w:val="20"/>
+        </w:rPr>
         <w:t xml:space="preserve"> DefinitionTerm </w:t>
       </w:r>
     </w:p>
     <w:p>
       <w:pPr>
         <w:pStyle w:val="Definition"/>
-      </w:pPr>
-      <w:r>
+        <w:rPr>
+          <w:sz w:val="20"/>
+          <w:szCs w:val="20"/>
+        </w:rPr>
+      </w:pPr>
+      <w:r>
+        <w:rPr>
+          <w:sz w:val="20"/>
+          <w:szCs w:val="20"/>
+        </w:rPr>
         <w:t xml:space="preserve"> Definition </w:t>
       </w:r>
     </w:p>
     <w:p>
       <w:pPr>
         <w:pStyle w:val="DefinitionTerm"/>
-      </w:pPr>
-      <w:r>
+        <w:rPr>
+          <w:sz w:val="20"/>
+          <w:szCs w:val="20"/>
+        </w:rPr>
+      </w:pPr>
+      <w:r>
+        <w:rPr>
+          <w:sz w:val="20"/>
+          <w:szCs w:val="20"/>
+        </w:rPr>
         <w:t xml:space="preserve"> DefinitionTerm </w:t>
       </w:r>
     </w:p>
     <w:p>
       <w:pPr>
         <w:pStyle w:val="Definition"/>
-      </w:pPr>
-      <w:r>
+        <w:rPr>
+          <w:sz w:val="20"/>
+          <w:szCs w:val="20"/>
+        </w:rPr>
+      </w:pPr>
+      <w:r>
+        <w:rPr>
+          <w:sz w:val="20"/>
+          <w:szCs w:val="20"/>
+        </w:rPr>
         <w:t xml:space="preserve"> Definition</w:t>
       </w:r>
     </w:p>
@@ -371,7 +522,14 @@
         <w:footnoteRef/>
       </w:r>
       <w:r>
-        <w:t xml:space="preserve"> Footnote Text.</w:t>
+        <w:t xml:space="preserve"> </w:t>
+      </w:r>
+      <w:r>
+        <w:rPr>
+          <w:sz w:val="20"/>
+          <w:szCs w:val="20"/>
+        </w:rPr>
+        <w:t>Footnote Text.</w:t>
       </w:r>
     </w:p>
   </w:footnote>
@@ -957,6 +1115,7 @@
   <w:style w:type="character" w:default="1" w:styleId="DefaultParagraphFont">
     <w:name w:val="Default Paragraph Font"/>
     <w:uiPriority w:val="1"/>
+    <w:semiHidden/>
     <w:unhideWhenUsed/>
   </w:style>
   <w:style w:type="table" w:default="1" w:styleId="TableNormal">
@@ -1009,7 +1168,7 @@
     <w:link w:val="TitleChar"/>
     <w:uiPriority w:val="10"/>
     <w:qFormat/>
-    <w:rsid w:val="00A10FD9"/>
+    <w:rsid w:val="00C4370E"/>
     <w:pPr>
       <w:spacing w:after="80"/>
       <w:contextualSpacing/>
@@ -1017,6 +1176,7 @@
     </w:pPr>
     <w:rPr>
       <w:rFonts w:asciiTheme="majorHAnsi" w:eastAsiaTheme="majorEastAsia" w:hAnsiTheme="majorHAnsi" w:cstheme="majorBidi"/>
+      <w:color w:val="0F4761" w:themeColor="accent1" w:themeShade="BF"/>
       <w:sz w:val="56"/>
       <w:szCs w:val="56"/>
     </w:rPr>
@@ -1026,9 +1186,10 @@
     <w:basedOn w:val="DefaultParagraphFont"/>
     <w:link w:val="Title"/>
     <w:uiPriority w:val="10"/>
-    <w:rsid w:val="00A10FD9"/>
+    <w:rsid w:val="00C4370E"/>
     <w:rPr>
       <w:rFonts w:asciiTheme="majorHAnsi" w:eastAsiaTheme="majorEastAsia" w:hAnsiTheme="majorHAnsi" w:cstheme="majorBidi"/>
+      <w:color w:val="0F4761" w:themeColor="accent1" w:themeShade="BF"/>
       <w:sz w:val="56"/>
       <w:szCs w:val="56"/>
     </w:rPr>
@@ -1040,13 +1201,15 @@
     <w:link w:val="SubtitleChar"/>
     <w:uiPriority w:val="11"/>
     <w:qFormat/>
-    <w:rsid w:val="00A10FD9"/>
+    <w:rsid w:val="00C4370E"/>
     <w:pPr>
       <w:numPr>
         <w:ilvl w:val="1"/>
       </w:numPr>
     </w:pPr>
     <w:rPr>
+      <w:i/>
+      <w:color w:val="auto"/>
       <w:spacing w:val="15"/>
       <w:sz w:val="28"/>
       <w:szCs w:val="28"/>
@@ -1057,10 +1220,10 @@
     <w:basedOn w:val="DefaultParagraphFont"/>
     <w:link w:val="Subtitle"/>
     <w:uiPriority w:val="11"/>
-    <w:rsid w:val="00A10FD9"/>
-    <w:rPr>
-      <w:rFonts w:eastAsiaTheme="majorEastAsia" w:cstheme="majorBidi"/>
-      <w:color w:val="595959" w:themeColor="text1" w:themeTint="A6"/>
+    <w:rsid w:val="00C4370E"/>
+    <w:rPr>
+      <w:rFonts w:asciiTheme="majorHAnsi" w:eastAsiaTheme="majorEastAsia" w:hAnsiTheme="majorHAnsi" w:cstheme="majorBidi"/>
+      <w:i/>
       <w:spacing w:val="15"/>
       <w:sz w:val="28"/>
       <w:szCs w:val="28"/>
@@ -1409,6 +1572,28 @@
     <w:rsid w:val="00B370BB"/>
     <w:rPr>
       <w:color w:val="666666"/>
+    </w:rPr>
+  </w:style>
+  <w:style w:type="paragraph" w:customStyle="1" w:styleId="CoverText">
+    <w:name w:val="Cover Text"/>
+    <w:basedOn w:val="Normal"/>
+    <w:qFormat/>
+    <w:rsid w:val="00A43823"/>
+    <w:rPr>
+      <w:i/>
+      <w:sz w:val="16"/>
+    </w:rPr>
+  </w:style>
+  <w:style w:type="paragraph" w:customStyle="1" w:styleId="FrontmatterHeading">
+    <w:name w:val="Frontmatter Heading"/>
+    <w:basedOn w:val="Title"/>
+    <w:qFormat/>
+    <w:rsid w:val="00C4370E"/>
+    <w:pPr>
+      <w:jc w:val="left"/>
+    </w:pPr>
+    <w:rPr>
+      <w:sz w:val="40"/>
     </w:rPr>
   </w:style>
 </w:styles>

</xml_diff>

<commit_message>
Cleaning up equations so the render well in Word/PDF
</commit_message>
<xml_diff>
--- a/reference.docx
+++ b/reference.docx
@@ -185,7 +185,6 @@
       <w:r>
         <w:rPr>
           <w:rStyle w:val="VerbatimChar"/>
-          <w:sz w:val="20"/>
           <w:szCs w:val="20"/>
         </w:rPr>
         <w:t xml:space="preserve"> Verbatim </w:t>
@@ -194,7 +193,6 @@
       <w:r>
         <w:rPr>
           <w:rStyle w:val="VerbatimChar"/>
-          <w:sz w:val="20"/>
           <w:szCs w:val="20"/>
         </w:rPr>
         <w:t xml:space="preserve">Char </w:t>
@@ -244,18 +242,8 @@
     <w:p>
       <w:pPr>
         <w:pStyle w:val="BlockText"/>
-        <w:rPr>
-          <w:rFonts w:ascii="Consolas" w:hAnsi="Consolas"/>
-          <w:sz w:val="20"/>
-          <w:szCs w:val="20"/>
-        </w:rPr>
-      </w:pPr>
-      <w:r>
-        <w:rPr>
-          <w:rFonts w:ascii="Consolas" w:hAnsi="Consolas"/>
-          <w:sz w:val="20"/>
-          <w:szCs w:val="20"/>
-        </w:rPr>
+      </w:pPr>
+      <w:r>
         <w:t xml:space="preserve"> Block Text. </w:t>
       </w:r>
     </w:p>
@@ -406,7 +394,23 @@
           <w:sz w:val="20"/>
           <w:szCs w:val="20"/>
         </w:rPr>
-        <w:t xml:space="preserve"> DefinitionTerm </w:t>
+        <w:t xml:space="preserve"> </w:t>
+      </w:r>
+      <w:proofErr w:type="spellStart"/>
+      <w:r>
+        <w:rPr>
+          <w:sz w:val="20"/>
+          <w:szCs w:val="20"/>
+        </w:rPr>
+        <w:t>DefinitionTerm</w:t>
+      </w:r>
+      <w:proofErr w:type="spellEnd"/>
+      <w:r>
+        <w:rPr>
+          <w:sz w:val="20"/>
+          <w:szCs w:val="20"/>
+        </w:rPr>
+        <w:t xml:space="preserve"> </w:t>
       </w:r>
     </w:p>
     <w:p>
@@ -438,7 +442,23 @@
           <w:sz w:val="20"/>
           <w:szCs w:val="20"/>
         </w:rPr>
-        <w:t xml:space="preserve"> DefinitionTerm </w:t>
+        <w:t xml:space="preserve"> </w:t>
+      </w:r>
+      <w:proofErr w:type="spellStart"/>
+      <w:r>
+        <w:rPr>
+          <w:sz w:val="20"/>
+          <w:szCs w:val="20"/>
+        </w:rPr>
+        <w:t>DefinitionTerm</w:t>
+      </w:r>
+      <w:proofErr w:type="spellEnd"/>
+      <w:r>
+        <w:rPr>
+          <w:sz w:val="20"/>
+          <w:szCs w:val="20"/>
+        </w:rPr>
+        <w:t xml:space="preserve"> </w:t>
       </w:r>
     </w:p>
     <w:p>
@@ -455,6 +475,18 @@
           <w:szCs w:val="20"/>
         </w:rPr>
         <w:t xml:space="preserve"> Definition</w:t>
+      </w:r>
+    </w:p>
+    <w:p>
+      <w:pPr>
+        <w:pStyle w:val="DisplayMath"/>
+        <w:jc w:val="center"/>
+      </w:pPr>
+      <w:r>
+        <w:t xml:space="preserve">Display </w:t>
+      </w:r>
+      <w:r>
+        <w:t>Math</w:t>
       </w:r>
     </w:p>
     <w:sectPr>
@@ -1420,6 +1452,7 @@
     <w:uiPriority w:val="9"/>
     <w:unhideWhenUsed/>
     <w:qFormat/>
+    <w:rsid w:val="00C0514F"/>
     <w:pPr>
       <w:spacing w:before="100" w:after="100"/>
       <w:ind w:left="480" w:right="480"/>
@@ -1531,9 +1564,10 @@
   <w:style w:type="character" w:customStyle="1" w:styleId="VerbatimChar">
     <w:name w:val="Verbatim Char"/>
     <w:basedOn w:val="CaptionChar"/>
-    <w:rPr>
-      <w:rFonts w:ascii="Consolas" w:hAnsi="Consolas"/>
-      <w:sz w:val="22"/>
+    <w:rsid w:val="00610FB3"/>
+    <w:rPr>
+      <w:rFonts w:ascii="Courier New" w:hAnsi="Courier New"/>
+      <w:sz w:val="20"/>
     </w:rPr>
   </w:style>
   <w:style w:type="character" w:customStyle="1" w:styleId="SectionNumber">
@@ -1594,6 +1628,18 @@
     </w:pPr>
     <w:rPr>
       <w:sz w:val="40"/>
+    </w:rPr>
+  </w:style>
+  <w:style w:type="paragraph" w:customStyle="1" w:styleId="DisplayMath">
+    <w:name w:val="Display Math"/>
+    <w:basedOn w:val="Definition"/>
+    <w:qFormat/>
+    <w:rsid w:val="007357B6"/>
+    <w:rPr>
+      <w:rFonts w:ascii="Cambria Math" w:hAnsi="Cambria Math"/>
+      <w:i/>
+      <w:sz w:val="20"/>
+      <w:szCs w:val="20"/>
     </w:rPr>
   </w:style>
 </w:styles>

</xml_diff>